<commit_message>
la captura se exporta perfecta
</commit_message>
<xml_diff>
--- a/outputs/EIA_simplificada_20251021.docx
+++ b/outputs/EIA_simplificada_20251021.docx
@@ -7054,7 +7054,7 @@
     <w:p>
       <w:pPr/>
       <w:r>
-        <w:t>La zona se incluye dentro de la Hoja n°307 del Mapa Topográfico Nacional de España, Escala 1:50.000, “Ferreras de Abajo”.</w:t>
+        <w:t>La zona se incluye dentro de la Hoja n° 307 del Mapa Topográfico Nacional de España, escala 1:50.000, “Ferreras de Abajo”.</w:t>
       </w:r>
     </w:p>
     <w:p>
@@ -8754,7 +8754,7 @@
       <w:r>
         <w:t xml:space="preserve">CAUDAL MEDIO EQUIVALENTE (Q m eq)  </w:t>
         <w:br/>
-        <w:t xml:space="preserve">Q m eq = 12.042.000 L/año / (365 · 24 · 3600) s/año </w:t>
+        <w:t>Q m eq = 12.042.000 L/año / (365 · 24 · 3600) s/año</w:t>
         <w:tab/>
         <w:t>= 0,38 L/s</w:t>
       </w:r>
@@ -8766,7 +8766,7 @@
       <w:r>
         <w:t xml:space="preserve">CAUDAL MÁXIMO INSTANTÁNEO (Q M i)  </w:t>
         <w:br/>
-        <w:t xml:space="preserve">Q M i = 12.042.000 L/año / (1.672 h/año x 3.600 s/h) </w:t>
+        <w:t>Q M i = 12.042.000 L/año / (1.672 h/año x 3.600 s/h)</w:t>
         <w:tab/>
         <w:t>= 2 L/s</w:t>
       </w:r>
@@ -8784,7 +8784,13 @@
         <w:ind w:left="426"/>
       </w:pPr>
       <w:r>
-        <w:t>SONDEO NUEVO</w:t>
+        <w:t xml:space="preserve">SONDEO NUEVO  </w:t>
+        <w:br/>
+        <w:t xml:space="preserve">Volumen máximo anual utilizado: 40 %  </w:t>
+        <w:br/>
+        <w:t>Volumen total anual 40 %</w:t>
+        <w:tab/>
+        <w:t>= 8.028 m³/año = 8.028.000 L/año</w:t>
       </w:r>
     </w:p>
     <w:p>
@@ -8792,27 +8798,11 @@
         <w:ind w:left="426"/>
       </w:pPr>
       <w:r>
-        <w:t xml:space="preserve">VOLUMEN TOTAL ANUAL (40 %)  </w:t>
+        <w:t xml:space="preserve">Caudal necesario:  </w:t>
         <w:br/>
-        <w:t>Volumen total anual 40 % = 8.028 m³/año = 8.028.000 L/año</w:t>
-      </w:r>
-    </w:p>
-    <w:p>
-      <w:pPr>
-        <w:ind w:left="426"/>
-      </w:pPr>
-      <w:r>
-        <w:t>CAUDAL NECESARIO SONDEO NUEVO</w:t>
-      </w:r>
-    </w:p>
-    <w:p>
-      <w:pPr>
-        <w:ind w:left="426"/>
-      </w:pPr>
-      <w:r>
-        <w:t xml:space="preserve">CAUDAL MEDIO EQUIVALENTE (Q m eq)  </w:t>
+        <w:t xml:space="preserve">Caudal medio equivalente (Q m eq)  </w:t>
         <w:br/>
-        <w:t xml:space="preserve">Q m eq = 8.028.000 L/año / (365 · 24 · 3600) s/año </w:t>
+        <w:t>Q m eq = 8.028.000 L/año / (365 · 24 · 3600) s/año</w:t>
         <w:tab/>
         <w:t>= 0,25 L/s</w:t>
       </w:r>
@@ -8822,9 +8812,9 @@
         <w:ind w:left="426"/>
       </w:pPr>
       <w:r>
-        <w:t xml:space="preserve">CAUDAL MÁXIMO INSTANTÁNEO (Q M i)  </w:t>
+        <w:t xml:space="preserve">Caudal máximo instantáneo (Q M i)  </w:t>
         <w:br/>
-        <w:t xml:space="preserve">Q M i = 8.028.000 L/año / (1.115 h/año x 3.600 s/h) </w:t>
+        <w:t>Q M i = 8.028.000 L/año / (1.115 h/año x 3.600 s/h)</w:t>
         <w:tab/>
         <w:t>= 2 L/s</w:t>
       </w:r>
@@ -8834,15 +8824,9 @@
         <w:ind w:left="426"/>
       </w:pPr>
       <w:r>
-        <w:t>NOTA</w:t>
-      </w:r>
-    </w:p>
-    <w:p>
-      <w:pPr>
-        <w:ind w:left="426"/>
-      </w:pPr>
-      <w:r>
-        <w:t>Según la actual legislación en materia de aguas, por la que se rige el Organismo de Cuenca implicado en este caso, aquellos sondeos que se realicen a una distancia inferior a 100 m de otro sondeo preexistente (siempre que la distancia entre ambos sea la mínima obligatoria), podrán bombear como máximo un caudal menor a 0,15 L/s.</w:t>
+        <w:t xml:space="preserve">NOTA  </w:t>
+        <w:br/>
+        <w:t>Según la legislación vigente en materia de aguas, aplicable por el Organismo de Cuenca correspondiente, los sondeos que se realicen a una distancia inferior a 100 m de otro sondeo preexistente (cumpliendo con la distancia mínima obligatoria) podrán extraer un caudal máximo inferior a 0,15 L/s.</w:t>
       </w:r>
     </w:p>
     <w:p>
@@ -9404,17 +9388,17 @@
         </w:rPr>
       </w:r>
       <w:r>
-        <w:t>- Alternativa 0 - No actuación: Mantener la situación actual sin realizar extracciones de agua, lo que implicaría no garantizar el abastecimiento necesario para la población del municipio.</w:t>
+        <w:t>- Alternativa 0 - No actuación: Mantener la situación actual sin realizar intervenciones, lo que implica no garantizar el abastecimiento de agua potable en el municipio, afectando la calidad de vida y el desarrollo local.</w:t>
         <w:br/>
-        <w:t>- Alternativa 1 - Sondeo: Realización de un sondeo para la extracción de agua subterránea, con diámetro inicial y definitivo adecuados para garantizar caudales suficientes para abastecimiento.</w:t>
+        <w:t>- Alternativa 1 - Sondeo: Realización de un sondeo para extracción de agua subterránea, con diámetro inicial y definitivo adecuados para garantizar caudales suficientes para abastecimiento, considerando la profundidad aún por determinar.</w:t>
         <w:br/>
-        <w:t>- Alternativa 2 - Pozo tradicional: Construcción de un pozo excavado manualmente o con maquinaria ligera, método tradicional para captación de agua subterránea, con limitaciones en profundidad y caudal.</w:t>
+        <w:t>- Alternativa 2 - Pozo tradicional: Excavación manual o mecánica de un pozo tradicional, con menor profundidad y diámetro limitado, que puede no asegurar la cantidad ni calidad necesaria para el abastecimiento.</w:t>
         <w:br/>
-        <w:t>- Alternativa 3 - Captación superficial: Extracción de agua de fuentes superficiales como ríos o lagos cercanos, sujeta a variabilidad estacional y calidad del recurso.</w:t>
+        <w:t>- Alternativa 3 - Captación superficial: Captación de agua en fuentes superficiales como ríos o lagos cercanos, que puede presentar variabilidad en caudal y calidad, afectando la continuidad y seguridad del abastecimiento.</w:t>
         <w:br/>
-        <w:t>- Alternativa 4 - Transporte mediante cubas: Suministro de agua potable mediante transporte en camiones cisterna, solución temporal con costos elevados y limitaciones logísticas.</w:t>
+        <w:t>- Alternativa 4 - Transporte mediante cubas: Suministro de agua mediante transporte en camiones cisterna, solución temporal y costosa, con limitaciones en volumen y frecuencia para abastecimiento permanente.</w:t>
         <w:br/>
-        <w:t>- Alternativa 5 - Conexión a la red municipal: Vinculación a la red de abastecimiento de agua potable del municipio o localidades cercanas, dependiente de la disponibilidad y capacidad de la infraestructura existente.</w:t>
+        <w:t>- Alternativa 5 - Conexión a la red municipal: Conexión a una red de abastecimiento existente en municipios cercanos, que puede requerir infraestructura extensa y costos elevados, además de depender de la capacidad y disponibilidad externa.</w:t>
       </w:r>
     </w:p>
     <w:p>
@@ -9443,7 +9427,7 @@
       <w:proofErr w:type="spellEnd"/>
       <w:r/>
       <w:r>
-        <w:t>La valoración técnica indica que la alternativa 0 no satisface la necesidad básica de abastecimiento, por lo que se descarta. El pozo tradicional (Alternativa 2) presenta limitaciones en profundidad y caudal, dificultando garantizar el suministro continuo. La captación superficial (Alternativa 3) está sujeta a la variabilidad estacional y a posibles problemas de calidad del agua, lo que compromete la fiabilidad del abastecimiento. El transporte mediante cubas (Alternativa 4) es económicamente oneroso y logísticamente complejo para un suministro permanente. La conexión a la red municipal (Alternativa 5) depende de la existencia y capacidad de infraestructura cercana, que en este caso no es viable o no garantiza el abastecimiento requerido. En contraste, la realización de un sondeo (Alternativa 1) permite acceder a recursos subterráneos más estables, con control sobre la calidad y caudal, siendo técnica y económicamente más factible y ambientalmente menos impactante que otras opciones.</w:t>
+        <w:t>La valoración técnica, económica y ambiental de las alternativas muestra que la no actuación no satisface la necesidad básica de abastecimiento. Los pozos tradicionales presentan limitaciones técnicas para garantizar caudales adecuados y pueden no ser sostenibles a largo plazo. La captación superficial está sujeta a variabilidad estacional y riesgos de contaminación, lo que compromete la calidad del agua. El transporte mediante cubas es una solución temporal con altos costos operativos y limitaciones logísticas que no garantizan un suministro continuo. La conexión a la red municipal, aunque viable, implica inversiones significativas en infraestructura y dependencia externa, además de posibles impactos ambientales por la construcción de conducciones. En contraste, el sondeo ofrece una solución técnica viable, con menor impacto ambiental y costos operativos más controlados, adaptándose a la demanda prevista para abastecimiento.</w:t>
       </w:r>
     </w:p>
     <w:p>
@@ -9471,7 +9455,7 @@
       </w:r>
       <w:r>
         <w:rPr/>
-        <w:t>La elección del sondeo como alternativa óptima responde a la necesidad de garantizar un abastecimiento estable y sostenible de agua potable para el municipio. Esta opción permite alcanzar acuíferos subterráneos con mayor seguridad en la disponibilidad del recurso, minimizando la dependencia de fuentes superficiales o externas. Además, el sondeo ofrece un control técnico adecuado sobre la extracción, con diámetros inicial y definitivo que aseguran el caudal necesario. Ambientalmente, el impacto es reducido si se realiza conforme a normativas vigentes, evitando la sobreexplotación y protegiendo la calidad del agua. Por tanto, el sondeo es la alternativa más viable técnica, económica y ambientalmente para el uso previsto..</w:t>
+        <w:t>La alternativa elegida, el sondeo, se justifica por su capacidad para proporcionar un suministro continuo y de calidad adecuado para el abastecimiento municipal. Técnicamente, permite alcanzar acuíferos profundos con diámetros adecuados para garantizar caudales suficientes, minimizando la vulnerabilidad a variaciones superficiales. Ambientalmente, reduce la alteración de ecosistemas superficiales y limita el impacto visual y físico en el entorno. Además, la inversión inicial y los costos de operación son razonables en comparación con otras alternativas, asegurando la sostenibilidad del recurso y la viabilidad a largo plazo del abastecimiento para la población..</w:t>
       </w:r>
     </w:p>
     <w:p>
@@ -9606,7 +9590,7 @@
         </w:rPr>
       </w:r>
       <w:r>
-        <w:t>El terreno ubicado en la Vega de Tera, polígono y parcela especificados, presenta una ocupación predominantemente agrícola, con cultivos de cereal y vegetación herbácea que cubre gran parte de la superficie. Las parcelas adyacentes están dedicadas a la agricultura extensiva, lo que contribuye a un paisaje agrícola homogéneo. Asimismo, se observan construcciones rurales, como almacenes y naves destinadas a la actividad agrícola, que se encuentran en estado funcional y bien conservadas. Sin embargo, se identifican áreas con signos de erosión superficial y compactación del suelo, lo que sugiere la necesidad de implementar prácticas de manejo sostenible. En general, el estado del terreno es adecuado para su uso actual, aunque se recomienda realizar un seguimiento de los impactos ambientales asociados a las prácticas agrícolas intensivas en la zona.</w:t>
+        <w:t>El terreno situado en la Vega de Tera, polígono y parcela designados, presenta una ocupación predominantemente agrícola, con cultivos de cereales y forrajes que ocupan la mayor parte de la superficie. Las coberturas vegetales se caracterizan por la presencia de praderas naturales y cultivos extensivos, lo que contribuye a la biodiversidad local. En las proximidades, se observan construcciones vinculadas a la actividad agropecuaria, como almacenes y naves para maquinaria, que no alteran significativamente el entorno. El estado general del terreno es adecuado, con un manejo sostenible que permite mantener la calidad del suelo y minimizar la erosión, aunque se recomienda realizar un seguimiento continuo para garantizar el equilibrio ecológico y la viabilidad de los cultivos a largo plazo.</w:t>
       </w:r>
     </w:p>
     <w:p>
@@ -9617,17 +9601,43 @@
           <w:rFonts w:cs="Times New Roman"/>
         </w:rPr>
       </w:pPr>
-      <w:r>
-        <w:rPr>
-          <w:noProof/>
-        </w:rPr>
-      </w:r>
-      <w:r>
-        <w:rPr>
-          <w:noProof/>
-        </w:rPr>
-      </w:r>
       <w:r/>
+    </w:p>
+    <w:p>
+      <w:r>
+        <w:drawing>
+          <wp:inline xmlns:a="http://schemas.openxmlformats.org/drawingml/2006/main" xmlns:pic="http://schemas.openxmlformats.org/drawingml/2006/picture">
+            <wp:extent cx="5029200" cy="2468761"/>
+            <wp:docPr id="1934320007" name="Picture 1934320007"/>
+            <wp:cNvGraphicFramePr>
+              <a:graphicFrameLocks noChangeAspect="1"/>
+            </wp:cNvGraphicFramePr>
+            <a:graphic>
+              <a:graphicData uri="http://schemas.openxmlformats.org/drawingml/2006/picture">
+                <pic:pic>
+                  <pic:nvPicPr>
+                    <pic:cNvPr id="0" name="captura_usos_1761082437.png"/>
+                    <pic:cNvPicPr/>
+                  </pic:nvPicPr>
+                  <pic:blipFill>
+                    <a:blip r:embed="rId15"/>
+                    <a:stretch>
+                      <a:fillRect/>
+                    </a:stretch>
+                  </pic:blipFill>
+                  <pic:spPr>
+                    <a:xfrm>
+                      <a:off x="0" y="0"/>
+                      <a:ext cx="5029200" cy="2468761"/>
+                    </a:xfrm>
+                    <a:prstGeom prst="rect"/>
+                  </pic:spPr>
+                </pic:pic>
+              </a:graphicData>
+            </a:graphic>
+          </wp:inline>
+        </w:drawing>
+      </w:r>
     </w:p>
     <w:p>
       <w:pPr>
@@ -11450,13 +11460,13 @@
       <w:r/>
       <w:r>
         <w:rPr/>
-        <w:t>Población. El uso del sondeo como apoyo para la captación de aguas subterráneas destinado al abastecimiento de la población de Junquera de Tera genera un impacto social positivo, ya que contribuye directamente a garantizar el suministro hídrico necesario para el consumo doméstico y otros usos básicos de la comunidad. Este efecto es directo, pues la mejora en la disponibilidad y calidad del agua influye de manera inmediata en el bienestar y la salud pública, así como en la estabilidad social al reducir la vulnerabilidad ante posibles episodios de escasez hídrica.</w:t>
+        <w:t>Población. La instalación y operación del sondeo para captación de aguas subterráneas destinado al abastecimiento de la población de Junquera de Tera generará un impacto social positivo, al asegurar un suministro hídrico estable y de calidad que mejora el bienestar de la comunidad. Este efecto es directo, dado que la función principal del sondeo es dotar a la población de agua potable suficiente para satisfacer sus necesidades básicas, contribuyendo a la salud pública y la calidad de vida.</w:t>
         <w:br/>
         <w:br/>
-        <w:t>La duración del impacto es a largo plazo, dada la continuidad en el uso del sondeo durante la fase de funcionamiento, y su reversibilidad es moderada, ya que cualquier alteración o fallo en el sistema de captación podría revertir las condiciones actuales de abastecimiento si no se gestionan adecuadamente los recursos hídricos. No obstante, con un manejo sostenible y controlado, el uso del sondeo garantiza un suministro estable y confiable.</w:t>
+        <w:t>La duración de este impacto será continua durante la fase de funcionamiento, siempre que se mantenga una adecuada gestión y control del recurso subterráneo, lo que garantiza la sostenibilidad del abastecimiento a largo plazo. Además, el impacto es reversible en caso de interrupción del suministro o mantenimiento del sondeo, aunque esto podría generar efectos negativos temporales en la población.</w:t>
         <w:br/>
         <w:br/>
-        <w:t>El dictamen se considera admisible y compatible con la dinámica social de Junquera de Tera, con una valoración moderada en función de la correcta implementación de medidas de gestión del recurso y mantenimiento del sondeo. En consecuencia, el proyecto contribuirá significativamente a mejorar la calidad de vida de la población, fortaleciendo la resiliencia comunitaria frente a variaciones en la disponibilidad de agua subterránea.</w:t>
+        <w:t>Se considera que el dictamen ambiental de este impacto es admisible y compatible con la actividad, presentando una valoración moderada en términos sociales, dado que el uso racional y monitoreado del recurso contribuirá al desarrollo comunitario sin generar afectaciones significativas. Se recomienda implementar medidas de seguimiento y mantenimiento para asegurar la continuidad y calidad del suministro hídrico.</w:t>
       </w:r>
     </w:p>
     <w:p>
@@ -11744,7 +11754,7 @@
       <w:proofErr w:type="spellEnd"/>
       <w:r/>
       <w:r>
-        <w:t>Durante la fase de cese del sondeo de apoyo para la captación de aguas subterráneas en Junquera de Tera, no se prevé la pérdida del recurso hídrico esencial, dado que la infraestructura principal de abastecimiento permanecerá operativa. Por tanto, el impacto social directo sobre la población será mínimo, manteniéndose la disponibilidad de agua potable sin alteraciones significativas. Desde el punto de vista económico, la paralización del proyecto no generará efectos adversos relevantes en la economía local, ya que no depende exclusivamente de la actividad del sondeo. Tampoco se anticipan impactos culturales de relevancia vinculados a esta fase. En conclusión, el cese del proyecto es compatible y genera un impacto social y económico moderado y admisible.</w:t>
+        <w:t>El cese de la actividad de sondeo para captación de aguas subterráneas no implica la pérdida inmediata de un recurso esencial, siempre que se mantengan los sistemas de abastecimiento ya establecidos. No obstante, podría generar incertidumbre en la población de Junquera de Tera respecto a la garantía y continuidad del suministro hídrico a largo plazo, afectando potencialmente la confianza en los servicios locales. Desde el punto de vista económico, la finalización de los trabajos implica la pérdida temporal de empleos directos e indirectos asociados al proyecto, aunque sin impactos significativos sobre la economía local debido a la naturaleza puntual de la actividad. Culturalmente, la fase de cese no afecta elementos patrimoniales ni tradiciones vinculadas al agua. En conjunto, el impacto social, económico y cultural del cese se considera moderado y compatible con la realidad local, siempre que se asegure el mantenimiento del abastecimiento de agua.</w:t>
       </w:r>
     </w:p>
     <w:p>
@@ -11795,7 +11805,7 @@
     <w:p>
       <w:pPr/>
       <w:r>
-        <w:t>El estudio de impacto ambiental realizado para el sondeo de apoyo destinado a la captación de aguas subterráneas para abastecimiento de la población de Junquera de Tera no ha identificado impactos críticos asociados al proyecto. Los efectos potenciales sobre el medio ambiente y la comunidad son de baja entidad y se presentan de forma temporal, principalmente durante la fase de ejecución. La implementación de medidas preventivas y correctivas adecuadas garantiza la minimización de impactos relacionados con la actividad, tales como posibles alteraciones temporales en la calidad del agua y la fauna local. En la fase de cese, se prevé una rápida recuperación ambiental dado el uso no industrial del recurso y la ausencia de residuos contaminantes significativos. En conclusión, el proyecto es ambientalmente razonable y compatible con los objetivos de sostenibilidad y abastecimiento hídrico de la zona.</w:t>
+        <w:t>El presente estudio de impacto ambiental para el sondeo de apoyo destinado a la captación de aguas subterráneas para abastecimiento de la población de Junquera de Tera no ha identificado impactos críticos sobre el entorno. Los efectos potenciales derivados de la instalación y operación del sondeo son compatibles o moderados, debido a la baja entidad del proyecto, su limitada duración en la fase de ejecución y la implementación de medidas preventivas orientadas a minimizar perturbaciones en los recursos hídricos y el medio ambiente circundante. Durante la fase de cese, es previsible una recuperación natural del área intervenida, sin efectos residuales significativos, dado que el uso destinado es de abastecimiento poblacional, sin generación de cargas contaminantes adicionales. En conclusión, el proyecto resulta ambientalmente razonable y compatible con los objetivos de preservación y sostenibilidad del entorno, contribuyendo a garantizar el suministro hídrico de la comunidad local de manera responsable.</w:t>
       </w:r>
     </w:p>
     <w:p>

</xml_diff>